<commit_message>
feat(cv): add security clearance, React web work, opt-in roles
- personal.clearance: Government of Canada Secret (Level II), valid to
  2035. Rendered under the contact line in the PDF and DOCX and as a chip
  in the site header. Screener answers updated to the confirmed level.
- RobotActions: React/TypeScript web app tested with Playwright E2E
  suites, so React web experience is no longer implied only by React
  Native work.
- optionalExperiences in resume.mjs plus `tailor --include <key>`: roles
  kept off the standard CV can be added to a single tailored CV. First
  entry is the ThirdBridge / Circle K contract (React web plus React
  Native iOS/Android), which overlaps Bell and RobotActions.
</commit_message>
<xml_diff>
--- a/public/KRISH_PAVULURI_CV.docx
+++ b/public/KRISH_PAVULURI_CV.docx
@@ -34,7 +34,7 @@
     </w:p>
     <w:p>
       <w:pPr>
-        <w:spacing w:after="240"/>
+        <w:spacing w:after="60"/>
         <w:jc w:val="center"/>
       </w:pPr>
       <w:r>
@@ -44,7 +44,7 @@
         </w:rPr>
         <w:t xml:space="preserve">Montreal, QC  |  438-928-0928  |  </w:t>
       </w:r>
-      <w:hyperlink w:history="1" r:id="rIdzswnu6y1qarlg00wsrcab">
+      <w:hyperlink w:history="1" r:id="rId7acvvrskfg5bka-oxwsrv">
         <w:r>
           <w:rPr>
             <w:rStyle w:val="Hyperlink"/>
@@ -61,7 +61,7 @@
         </w:rPr>
         <w:t xml:space="preserve">  |  </w:t>
       </w:r>
-      <w:hyperlink w:history="1" r:id="rId6nvxvdatmnz2ygrucod8k">
+      <w:hyperlink w:history="1" r:id="rIdytkh-uinf7olnuqgzgtx3">
         <w:r>
           <w:rPr>
             <w:rStyle w:val="Hyperlink"/>
@@ -78,7 +78,7 @@
         </w:rPr>
         <w:t xml:space="preserve">  |  </w:t>
       </w:r>
-      <w:hyperlink w:history="1" r:id="rIdxgqj7iojik6xygfernsvx">
+      <w:hyperlink w:history="1" r:id="rIdjtfjoxvva1jmaamd7rsg3">
         <w:r>
           <w:rPr>
             <w:rStyle w:val="Hyperlink"/>
@@ -91,6 +91,19 @@
     </w:p>
     <w:p>
       <w:pPr>
+        <w:spacing w:after="240"/>
+        <w:jc w:val="center"/>
+      </w:pPr>
+      <w:r>
+        <w:rPr>
+          <w:sz w:val="20"/>
+          <w:szCs w:val="20"/>
+        </w:rPr>
+        <w:t xml:space="preserve">Government of Canada Secret (Level II) Security Clearance · valid to 2035</w:t>
+      </w:r>
+    </w:p>
+    <w:p>
+      <w:pPr>
         <w:spacing w:after="200"/>
         <w:jc w:val="center"/>
       </w:pPr>
@@ -562,7 +575,7 @@
           <w:sz w:val="18"/>
           <w:szCs w:val="18"/>
         </w:rPr>
-        <w:t xml:space="preserve">Led codeless automation tooling for native and React Native iOS/Android apps with deep CI/CD and AI integrations.</w:t>
+        <w:t xml:space="preserve">Led codeless automation tooling for native and React Native iOS/Android apps and the platform's React web app, with deep CI/CD and AI integrations.</w:t>
       </w:r>
     </w:p>
     <w:p>
@@ -596,24 +609,24 @@
           <w:sz w:val="18"/>
           <w:szCs w:val="18"/>
         </w:rPr>
+        <w:t xml:space="preserve">Built and tested the platform's React and TypeScript web app, writing Playwright/TypeScript end-to-end suites that validate page content and user flows.</w:t>
+      </w:r>
+    </w:p>
+    <w:p>
+      <w:pPr>
+        <w:pStyle w:val="ListParagraph"/>
+        <w:numPr>
+          <w:ilvl w:val="0"/>
+          <w:numId w:val="1"/>
+        </w:numPr>
+        <w:spacing w:after="50"/>
+      </w:pPr>
+      <w:r>
+        <w:rPr>
+          <w:sz w:val="18"/>
+          <w:szCs w:val="18"/>
+        </w:rPr>
         <w:t xml:space="preserve">Implemented AI/ML services as containerized Python APIs (Docker) for AI-assisted element selection, AI chatbot test orchestration, and flake triage — callable from the codeless tools and from CI.</w:t>
-      </w:r>
-    </w:p>
-    <w:p>
-      <w:pPr>
-        <w:pStyle w:val="ListParagraph"/>
-        <w:numPr>
-          <w:ilvl w:val="0"/>
-          <w:numId w:val="1"/>
-        </w:numPr>
-        <w:spacing w:after="50"/>
-      </w:pPr>
-      <w:r>
-        <w:rPr>
-          <w:sz w:val="18"/>
-          <w:szCs w:val="18"/>
-        </w:rPr>
-        <w:t xml:space="preserve">Used OpenCV for vision-driven element matching so recorded steps survive layout and theme changes, and served HuggingFace Transformers models on PyTorch and TensorFlow behind those APIs for element classification and intent detection.</w:t>
       </w:r>
     </w:p>
     <w:p>

</xml_diff>